<commit_message>
Revision 1: corrected results, rebuilt components, C-MAPSS check, plan and registry
- Analysis plan with eleven dated amendments (the last with two corrections made
  before its analysis) and the registry of every run made under it; both files are
  stored byte-identical so that their SHA-256 matches Supplementary Material S1
- Revision code and results for PRONOSTIA and XJTU-SY: test predictions of every
  reported model, statistics, and the trained models of our final runs
- Amendment 10: rebuilt components of the network (code, selection files, test
  predictions, noise results, statistics)
- Amendment 11: C-MAPSS turbofan check of the calibration source (code, unit tests,
  run records, calibration errors and test predictions, statistics)
- README: what the revised paper shows, data access including C-MAPSS, reproduction
</commit_message>
<xml_diff>
--- a/highlights.docx
+++ b/highlights.docx
@@ -12,7 +12,7 @@
     </w:p>
     <w:p>
       <w:r>
-        <w:t>Leakage-Free, Monotonic, and Uncertainty-Calibrated Bearing RUL Prediction for Reliability-Centered Maintenance</w:t>
+        <w:t>How Evaluation Practice Misstates the Uncertainty of Bearing Remaining Useful Life Predictions for Maintenance Decisions</w:t>
       </w:r>
     </w:p>
     <w:p>
@@ -20,7 +20,7 @@
         <w:pStyle w:val="ListBullet"/>
       </w:pPr>
       <w:r>
-        <w:t>Leakage-free two-stage protocol prevents test-bearing model-selection bias.</w:t>
+        <w:t>Cost-optimal maintenance alarms use a tail quantile of the error on unseen bearings.</w:t>
       </w:r>
     </w:p>
     <w:p>
@@ -28,7 +28,7 @@
         <w:pStyle w:val="ListBullet"/>
       </w:pPr>
       <w:r>
-        <w:t>Soft PGMC regularizer is decoupled from hard PAVA/RTRM/CES post-processing guarantees.</w:t>
+        <w:t>Calibrating on training-bearing windows understated that tail by 1.8 to 9 times.</w:t>
       </w:r>
     </w:p>
     <w:p>
@@ -36,7 +36,7 @@
         <w:pStyle w:val="ListBullet"/>
       </w:pPr>
       <w:r>
-        <w:t>Leak-free calibration raises interval coverage from 59.9% to 89.1%, halving missed detections.</w:t>
+        <w:t>The understatement grew at later checkpoints, as the error on new bearings widened.</w:t>
       </w:r>
     </w:p>
     <w:p>
@@ -44,7 +44,7 @@
         <w:pStyle w:val="ListBullet"/>
       </w:pPr>
       <w:r>
-        <w:t>Alarm-timing analysis: the best-MAE method (PAVA) is not the best-decision method.</w:t>
+        <w:t>On PRONOSTIA, the calibration source moved coverage by 27 to 62 points per model.</w:t>
       </w:r>
     </w:p>
     <w:p>
@@ -52,7 +52,7 @@
         <w:pStyle w:val="ListBullet"/>
       </w:pPr>
       <w:r>
-        <w:t>Compact 0.19M-parameter dual-stream estimator; zero-shot cross-condition transfer remains unresolved.</w:t>
+        <w:t>Tests over seeds found four times as many significant differences as bearing tests.</w:t>
       </w:r>
     </w:p>
     <w:sectPr>

</xml_diff>